<commit_message>
entame de la conception du MCD
</commit_message>
<xml_diff>
--- a/Web/Documentations/02_Specifications/1_Exigences_fonctionnelles/FinTrack_Exigences_Fonctionnelles_et_Non_Fonctionnelles_V2.3.docx
+++ b/Web/Documentations/02_Specifications/1_Exigences_fonctionnelles/FinTrack_Exigences_Fonctionnelles_et_Non_Fonctionnelles_V2.3.docx
@@ -2110,7 +2110,7 @@
                 <w:sz w:val="20"/>
                 <w:szCs w:val="20"/>
               </w:rPr>
-              <w:t xml:space="preserve">Le système doit vérifier la disponibilité des fonds avant une dépense ou un transfert. Si les fonds sont insuffisants, la dépense ne peut être validée que selon EF-SF-003 et EF-SF-004.</w:t>
+              <w:t xml:space="preserve">Le système doit vérifier la disponibilité des fonds avant une dépense ou un transfert. Si les fonds sont insuffisants, la dépense ne peut être validée que selon EF-SF-003 et EF-SF-004 ; un transfert ou un remboursement de dette est refusé (EF-TR-039).</w:t>
             </w:r>
           </w:p>
         </w:tc>
@@ -2168,7 +2168,7 @@
                 <w:sz w:val="20"/>
                 <w:szCs w:val="20"/>
               </w:rPr>
-              <w:t xml:space="preserve">RB-SF-005</w:t>
+              <w:t xml:space="preserve">RB-SF-005 ; V1.2 §12.6</w:t>
             </w:r>
           </w:p>
         </w:tc>
@@ -3199,7 +3199,7 @@
                 <w:sz w:val="20"/>
                 <w:szCs w:val="20"/>
               </w:rPr>
-              <w:t xml:space="preserve">Le système doit distinguer les transactions « À qualifier » des opérations confirmées dans les soldes, indicateurs et rapports. Il peut rappeler les opérations non résolues ; à la qualification, les calculs concernés sont mis à jour et l’historique conservé.</w:t>
+              <w:t xml:space="preserve">Une opération « À qualifier » modifie le solde du compte concerné, car l’argent a réellement bougé, mais elle n’est comptée ni comme revenu, ni comme dépense, ni dans les budgets, analyses et indicateurs tant qu’elle n’est pas qualifiée ; elle est affichée à part. Le système peut rappeler les opérations non résolues ; à la qualification, les calculs concernés sont mis à jour et l’historique conservé.</w:t>
             </w:r>
           </w:p>
         </w:tc>
@@ -3257,7 +3257,7 @@
                 <w:sz w:val="20"/>
                 <w:szCs w:val="20"/>
               </w:rPr>
-              <w:t xml:space="preserve">V1.1 §10</w:t>
+              <w:t xml:space="preserve">V1.1 §10 ; V1.2 §12.5</w:t>
             </w:r>
           </w:p>
         </w:tc>
@@ -3621,6 +3621,127 @@
                 <w:szCs w:val="20"/>
               </w:rPr>
               <w:t xml:space="preserve">V1.1 §9 ; V1.2 §12.3</w:t>
+            </w:r>
+          </w:p>
+        </w:tc>
+      </w:tr>
+      <w:tr>
+        <w:trPr>
+          <w:cantSplit/>
+        </w:trPr>
+        <w:tc>
+          <w:tcPr>
+            <w:tcW w:type="dxa" w:w="1300"/>
+            <w:tcBorders>
+              <w:top w:val="single" w:color="BFC8D6" w:sz="4"/>
+              <w:left w:val="single" w:color="BFC8D6" w:sz="4"/>
+              <w:bottom w:val="single" w:color="BFC8D6" w:sz="4"/>
+              <w:right w:val="single" w:color="BFC8D6" w:sz="4"/>
+            </w:tcBorders>
+            <w:tcMar>
+              <w:top w:type="dxa" w:w="60"/>
+              <w:left w:type="dxa" w:w="100"/>
+              <w:bottom w:type="dxa" w:w="60"/>
+              <w:right w:type="dxa" w:w="100"/>
+            </w:tcMar>
+          </w:tcPr>
+          <w:p>
+            <w:pPr>
+              <w:spacing w:after="40"/>
+            </w:pPr>
+            <w:r>
+              <w:rPr>
+                <w:sz w:val="20"/>
+                <w:szCs w:val="20"/>
+              </w:rPr>
+              <w:t xml:space="preserve">EF-TR-039</w:t>
+            </w:r>
+          </w:p>
+        </w:tc>
+        <w:tc>
+          <w:tcPr>
+            <w:tcW w:type="dxa" w:w="5750"/>
+            <w:tcBorders>
+              <w:top w:val="single" w:color="BFC8D6" w:sz="4"/>
+              <w:left w:val="single" w:color="BFC8D6" w:sz="4"/>
+              <w:bottom w:val="single" w:color="BFC8D6" w:sz="4"/>
+              <w:right w:val="single" w:color="BFC8D6" w:sz="4"/>
+            </w:tcBorders>
+            <w:tcMar>
+              <w:top w:type="dxa" w:w="60"/>
+              <w:left w:type="dxa" w:w="100"/>
+              <w:bottom w:type="dxa" w:w="60"/>
+              <w:right w:type="dxa" w:w="100"/>
+            </w:tcMar>
+          </w:tcPr>
+          <w:p>
+            <w:pPr>
+              <w:spacing w:after="40"/>
+            </w:pPr>
+            <w:r>
+              <w:rPr>
+                <w:sz w:val="20"/>
+                <w:szCs w:val="20"/>
+              </w:rPr>
+              <w:t xml:space="preserve">Lorsqu’une opération est refusée faute de fonds suffisants (dépense bloquée, transfert, remboursement de dette), le système n’enregistre aucune opération et ne modifie aucun solde, mais conserve la tentative refusée dans l’historique : date et heure, type d’opération, compte, montant, devise et motif du refus.</w:t>
+            </w:r>
+          </w:p>
+        </w:tc>
+        <w:tc>
+          <w:tcPr>
+            <w:tcW w:type="dxa" w:w="620"/>
+            <w:tcBorders>
+              <w:top w:val="single" w:color="BFC8D6" w:sz="4"/>
+              <w:left w:val="single" w:color="BFC8D6" w:sz="4"/>
+              <w:bottom w:val="single" w:color="BFC8D6" w:sz="4"/>
+              <w:right w:val="single" w:color="BFC8D6" w:sz="4"/>
+            </w:tcBorders>
+            <w:tcMar>
+              <w:top w:type="dxa" w:w="60"/>
+              <w:left w:type="dxa" w:w="100"/>
+              <w:bottom w:type="dxa" w:w="60"/>
+              <w:right w:type="dxa" w:w="100"/>
+            </w:tcMar>
+          </w:tcPr>
+          <w:p>
+            <w:pPr>
+              <w:spacing w:after="40"/>
+            </w:pPr>
+            <w:r>
+              <w:rPr>
+                <w:sz w:val="20"/>
+                <w:szCs w:val="20"/>
+              </w:rPr>
+              <w:t xml:space="preserve">1</w:t>
+            </w:r>
+          </w:p>
+        </w:tc>
+        <w:tc>
+          <w:tcPr>
+            <w:tcW w:type="dxa" w:w="1968"/>
+            <w:tcBorders>
+              <w:top w:val="single" w:color="BFC8D6" w:sz="4"/>
+              <w:left w:val="single" w:color="BFC8D6" w:sz="4"/>
+              <w:bottom w:val="single" w:color="BFC8D6" w:sz="4"/>
+              <w:right w:val="single" w:color="BFC8D6" w:sz="4"/>
+            </w:tcBorders>
+            <w:tcMar>
+              <w:top w:type="dxa" w:w="60"/>
+              <w:left w:type="dxa" w:w="100"/>
+              <w:bottom w:type="dxa" w:w="60"/>
+              <w:right w:type="dxa" w:w="100"/>
+            </w:tcMar>
+          </w:tcPr>
+          <w:p>
+            <w:pPr>
+              <w:spacing w:after="40"/>
+            </w:pPr>
+            <w:r>
+              <w:rPr>
+                <w:sz w:val="20"/>
+                <w:szCs w:val="20"/>
+              </w:rPr>
+              <w:t xml:space="preserve">V1.2 §12.6</w:t>
             </w:r>
           </w:p>
         </w:tc>
@@ -17675,7 +17796,7 @@
                 <w:sz w:val="20"/>
                 <w:szCs w:val="20"/>
               </w:rPr>
-              <w:t xml:space="preserve">Le système doit distinguer dépenses réelles, non planifiées et prévisionnelles. Une dépense non planifiée n’est pas automatiquement qualifiée d’inutile.</w:t>
+              <w:t xml:space="preserve">Le système doit distinguer dépenses réelles, non planifiées et prévisionnelles. Une dépense non planifiée est une dépense réelle ni liée à une prévision, ni couverte par une limite du budget de la période (V1.2 §12.7) ; elle n’est pas automatiquement qualifiée d’inutile.</w:t>
             </w:r>
           </w:p>
         </w:tc>
@@ -17733,7 +17854,7 @@
                 <w:sz w:val="20"/>
                 <w:szCs w:val="20"/>
               </w:rPr>
-              <w:t xml:space="preserve">V1.1 §2, §6</w:t>
+              <w:t xml:space="preserve">V1.1 §2, §6 ; V1.2 §12.7</w:t>
             </w:r>
           </w:p>
         </w:tc>
@@ -19731,7 +19852,7 @@
                 <w:sz w:val="20"/>
                 <w:szCs w:val="20"/>
               </w:rPr>
-              <w:t xml:space="preserve">Le système doit permettre de restaurer une sauvegarde : choix d’une sauvegarde, confirmation de l’utilisateur et, si possible, contrôle d’intégrité.</w:t>
+              <w:t xml:space="preserve">Le système doit permettre de restaurer une sauvegarde : choix d’une sauvegarde, confirmation de l’utilisateur et, si possible, contrôle d’intégrité. Une sauvegarde de sécurité de l’état actuel est créée automatiquement avant tout remplacement.</w:t>
             </w:r>
           </w:p>
         </w:tc>
@@ -19789,7 +19910,7 @@
                 <w:sz w:val="20"/>
                 <w:szCs w:val="20"/>
               </w:rPr>
-              <w:t xml:space="preserve">V1.1 §3</w:t>
+              <w:t xml:space="preserve">V1.1 §3 ; V1.2 §12.8</w:t>
             </w:r>
           </w:p>
         </w:tc>
@@ -27186,6 +27307,195 @@
                 <w:sz w:val="20"/>
                 <w:szCs w:val="20"/>
               </w:rPr>
+              <w:t xml:space="preserve">EF-TR-039</w:t>
+            </w:r>
+          </w:p>
+        </w:tc>
+        <w:tc>
+          <w:tcPr>
+            <w:tcW w:type="dxa" w:w="7938"/>
+            <w:tcBorders>
+              <w:top w:val="single" w:color="BFC8D6" w:sz="4"/>
+              <w:left w:val="single" w:color="BFC8D6" w:sz="4"/>
+              <w:bottom w:val="single" w:color="BFC8D6" w:sz="4"/>
+              <w:right w:val="single" w:color="BFC8D6" w:sz="4"/>
+            </w:tcBorders>
+            <w:tcMar>
+              <w:top w:type="dxa" w:w="60"/>
+              <w:left w:type="dxa" w:w="100"/>
+              <w:bottom w:type="dxa" w:w="60"/>
+              <w:right w:type="dxa" w:w="100"/>
+            </w:tcMar>
+          </w:tcPr>
+          <w:p>
+            <w:pPr>
+              <w:spacing w:after="40"/>
+            </w:pPr>
+            <w:r>
+              <w:rPr>
+                <w:sz w:val="20"/>
+                <w:szCs w:val="20"/>
+              </w:rPr>
+              <w:t xml:space="preserve">Ajout (décision du propriétaire) : une action refusée faute de fonds n’enregistre aucune opération mais est historisée.</w:t>
+            </w:r>
+          </w:p>
+        </w:tc>
+      </w:tr>
+      <w:tr>
+        <w:trPr>
+          <w:cantSplit/>
+        </w:trPr>
+        <w:tc>
+          <w:tcPr>
+            <w:tcW w:type="dxa" w:w="1700"/>
+            <w:tcBorders>
+              <w:top w:val="single" w:color="BFC8D6" w:sz="4"/>
+              <w:left w:val="single" w:color="BFC8D6" w:sz="4"/>
+              <w:bottom w:val="single" w:color="BFC8D6" w:sz="4"/>
+              <w:right w:val="single" w:color="BFC8D6" w:sz="4"/>
+            </w:tcBorders>
+            <w:tcMar>
+              <w:top w:type="dxa" w:w="60"/>
+              <w:left w:type="dxa" w:w="100"/>
+              <w:bottom w:type="dxa" w:w="60"/>
+              <w:right w:type="dxa" w:w="100"/>
+            </w:tcMar>
+          </w:tcPr>
+          <w:p>
+            <w:pPr>
+              <w:spacing w:after="40"/>
+            </w:pPr>
+            <w:r>
+              <w:rPr>
+                <w:sz w:val="20"/>
+                <w:szCs w:val="20"/>
+              </w:rPr>
+              <w:t xml:space="preserve">EF-AN-009</w:t>
+            </w:r>
+          </w:p>
+        </w:tc>
+        <w:tc>
+          <w:tcPr>
+            <w:tcW w:type="dxa" w:w="7938"/>
+            <w:tcBorders>
+              <w:top w:val="single" w:color="BFC8D6" w:sz="4"/>
+              <w:left w:val="single" w:color="BFC8D6" w:sz="4"/>
+              <w:bottom w:val="single" w:color="BFC8D6" w:sz="4"/>
+              <w:right w:val="single" w:color="BFC8D6" w:sz="4"/>
+            </w:tcBorders>
+            <w:tcMar>
+              <w:top w:type="dxa" w:w="60"/>
+              <w:left w:type="dxa" w:w="100"/>
+              <w:bottom w:type="dxa" w:w="60"/>
+              <w:right w:type="dxa" w:w="100"/>
+            </w:tcMar>
+          </w:tcPr>
+          <w:p>
+            <w:pPr>
+              <w:spacing w:after="40"/>
+            </w:pPr>
+            <w:r>
+              <w:rPr>
+                <w:sz w:val="20"/>
+                <w:szCs w:val="20"/>
+              </w:rPr>
+              <w:t xml:space="preserve">Précision (décision du propriétaire) : définition de la dépense non planifiée.</w:t>
+            </w:r>
+          </w:p>
+        </w:tc>
+      </w:tr>
+      <w:tr>
+        <w:trPr>
+          <w:cantSplit/>
+        </w:trPr>
+        <w:tc>
+          <w:tcPr>
+            <w:tcW w:type="dxa" w:w="1700"/>
+            <w:tcBorders>
+              <w:top w:val="single" w:color="BFC8D6" w:sz="4"/>
+              <w:left w:val="single" w:color="BFC8D6" w:sz="4"/>
+              <w:bottom w:val="single" w:color="BFC8D6" w:sz="4"/>
+              <w:right w:val="single" w:color="BFC8D6" w:sz="4"/>
+            </w:tcBorders>
+            <w:tcMar>
+              <w:top w:type="dxa" w:w="60"/>
+              <w:left w:type="dxa" w:w="100"/>
+              <w:bottom w:type="dxa" w:w="60"/>
+              <w:right w:type="dxa" w:w="100"/>
+            </w:tcMar>
+          </w:tcPr>
+          <w:p>
+            <w:pPr>
+              <w:spacing w:after="40"/>
+            </w:pPr>
+            <w:r>
+              <w:rPr>
+                <w:sz w:val="20"/>
+                <w:szCs w:val="20"/>
+              </w:rPr>
+              <w:t xml:space="preserve">EF-SV-002</w:t>
+            </w:r>
+          </w:p>
+        </w:tc>
+        <w:tc>
+          <w:tcPr>
+            <w:tcW w:type="dxa" w:w="7938"/>
+            <w:tcBorders>
+              <w:top w:val="single" w:color="BFC8D6" w:sz="4"/>
+              <w:left w:val="single" w:color="BFC8D6" w:sz="4"/>
+              <w:bottom w:val="single" w:color="BFC8D6" w:sz="4"/>
+              <w:right w:val="single" w:color="BFC8D6" w:sz="4"/>
+            </w:tcBorders>
+            <w:tcMar>
+              <w:top w:type="dxa" w:w="60"/>
+              <w:left w:type="dxa" w:w="100"/>
+              <w:bottom w:type="dxa" w:w="60"/>
+              <w:right w:type="dxa" w:w="100"/>
+            </w:tcMar>
+          </w:tcPr>
+          <w:p>
+            <w:pPr>
+              <w:spacing w:after="40"/>
+            </w:pPr>
+            <w:r>
+              <w:rPr>
+                <w:sz w:val="20"/>
+                <w:szCs w:val="20"/>
+              </w:rPr>
+              <w:t xml:space="preserve">Précision (décision du propriétaire) : sauvegarde de sécurité automatique avant restauration.</w:t>
+            </w:r>
+          </w:p>
+        </w:tc>
+      </w:tr>
+      <w:tr>
+        <w:trPr>
+          <w:cantSplit/>
+        </w:trPr>
+        <w:tc>
+          <w:tcPr>
+            <w:tcW w:type="dxa" w:w="1700"/>
+            <w:tcBorders>
+              <w:top w:val="single" w:color="BFC8D6" w:sz="4"/>
+              <w:left w:val="single" w:color="BFC8D6" w:sz="4"/>
+              <w:bottom w:val="single" w:color="BFC8D6" w:sz="4"/>
+              <w:right w:val="single" w:color="BFC8D6" w:sz="4"/>
+            </w:tcBorders>
+            <w:tcMar>
+              <w:top w:type="dxa" w:w="60"/>
+              <w:left w:type="dxa" w:w="100"/>
+              <w:bottom w:type="dxa" w:w="60"/>
+              <w:right w:type="dxa" w:w="100"/>
+            </w:tcMar>
+          </w:tcPr>
+          <w:p>
+            <w:pPr>
+              <w:spacing w:after="40"/>
+            </w:pPr>
+            <w:r>
+              <w:rPr>
+                <w:sz w:val="20"/>
+                <w:szCs w:val="20"/>
+              </w:rPr>
               <w:t xml:space="preserve">EF-DE-012, 013</w:t>
             </w:r>
           </w:p>
@@ -27216,6 +27526,69 @@
                 <w:szCs w:val="20"/>
               </w:rPr>
               <w:t xml:space="preserve">Ajout : excédent de remboursement et devises différentes pour dettes et créances.</w:t>
+            </w:r>
+          </w:p>
+        </w:tc>
+      </w:tr>
+      <w:tr>
+        <w:trPr>
+          <w:cantSplit/>
+        </w:trPr>
+        <w:tc>
+          <w:tcPr>
+            <w:tcW w:type="dxa" w:w="1700"/>
+            <w:tcBorders>
+              <w:top w:val="single" w:color="BFC8D6" w:sz="4"/>
+              <w:left w:val="single" w:color="BFC8D6" w:sz="4"/>
+              <w:bottom w:val="single" w:color="BFC8D6" w:sz="4"/>
+              <w:right w:val="single" w:color="BFC8D6" w:sz="4"/>
+            </w:tcBorders>
+            <w:tcMar>
+              <w:top w:type="dxa" w:w="60"/>
+              <w:left w:type="dxa" w:w="100"/>
+              <w:bottom w:type="dxa" w:w="60"/>
+              <w:right w:type="dxa" w:w="100"/>
+            </w:tcMar>
+          </w:tcPr>
+          <w:p>
+            <w:pPr>
+              <w:spacing w:after="40"/>
+            </w:pPr>
+            <w:r>
+              <w:rPr>
+                <w:sz w:val="20"/>
+                <w:szCs w:val="20"/>
+              </w:rPr>
+              <w:t xml:space="preserve">EF-TR-035</w:t>
+            </w:r>
+          </w:p>
+        </w:tc>
+        <w:tc>
+          <w:tcPr>
+            <w:tcW w:type="dxa" w:w="7938"/>
+            <w:tcBorders>
+              <w:top w:val="single" w:color="BFC8D6" w:sz="4"/>
+              <w:left w:val="single" w:color="BFC8D6" w:sz="4"/>
+              <w:bottom w:val="single" w:color="BFC8D6" w:sz="4"/>
+              <w:right w:val="single" w:color="BFC8D6" w:sz="4"/>
+            </w:tcBorders>
+            <w:tcMar>
+              <w:top w:type="dxa" w:w="60"/>
+              <w:left w:type="dxa" w:w="100"/>
+              <w:bottom w:type="dxa" w:w="60"/>
+              <w:right w:type="dxa" w:w="100"/>
+            </w:tcMar>
+          </w:tcPr>
+          <w:p>
+            <w:pPr>
+              <w:spacing w:after="40"/>
+            </w:pPr>
+            <w:r>
+              <w:rPr>
+                <w:sz w:val="20"/>
+                <w:szCs w:val="20"/>
+              </w:rPr>
+              <w:t xml:space="preserve">Précision (décision du propriétaire) : une opération « À qualifier » modifie le solde du compte mais reste hors revenus, dépenses, budgets et analyses.</w:t>
             </w:r>
           </w:p>
         </w:tc>

</xml_diff>